<commit_message>
Add validation evidence for professor uplift
</commit_message>
<xml_diff>
--- a/docs/reports/professional_business_report.docx
+++ b/docs/reports/professional_business_report.docx
@@ -179,6 +179,15 @@
       </w:pPr>
       <w:r>
         <w:t>Added SQL feature view in features/fraud_feature_view.sql to show how the feature layer could be built in a warehouse.</w:t>
+      </w:r>
+    </w:p>
+    <w:p>
+      <w:pPr>
+        <w:pStyle w:val="ListBullet"/>
+        <w:spacing w:after="80"/>
+      </w:pPr>
+      <w:r>
+        <w:t>Added measured validation evidence: calibration bins, false-positive rate by country/channel, and SLA policy coverage.</w:t>
       </w:r>
     </w:p>
     <w:p>
@@ -743,7 +752,7 @@
               <w:rPr>
                 <w:b w:val="0"/>
               </w:rPr>
-              <w:t>£8 per case</w:t>
+              <w:t>GBP 8 per case</w:t>
             </w:r>
           </w:p>
         </w:tc>
@@ -781,7 +790,7 @@
               <w:rPr>
                 <w:b w:val="0"/>
               </w:rPr>
-              <w:t>52 x £8 = £416</w:t>
+              <w:t>52 x GBP 8 = GBP 416</w:t>
             </w:r>
           </w:p>
         </w:tc>
@@ -819,7 +828,7 @@
               <w:rPr>
                 <w:b w:val="0"/>
               </w:rPr>
-              <w:t>£416 / 2 = £208 per extra captured fraud</w:t>
+              <w:t>GBP 416 / 2 = GBP 208 per extra captured fraud</w:t>
             </w:r>
           </w:p>
         </w:tc>
@@ -857,7 +866,7 @@
               <w:rPr>
                 <w:color w:val="192026"/>
               </w:rPr>
-              <w:t>If each additional fraud case prevented avoids more than £208 of loss, the extra review work is financially justified.</w:t>
+              <w:t>If each additional fraud case prevented avoids more than GBP 208 of loss, the extra review work is financially justified.</w:t>
             </w:r>
           </w:p>
         </w:tc>
@@ -875,7 +884,383 @@
           <w:color w:val="2E74B5"/>
           <w:sz w:val="32"/>
         </w:rPr>
-        <w:t>6. Recommendation</w:t>
+        <w:t>6. Validation Evidence</w:t>
+      </w:r>
+    </w:p>
+    <w:tbl>
+      <w:tblPr>
+        <w:tblStyle w:val="TableGrid"/>
+        <w:tblW w:type="auto" w:w="0"/>
+        <w:jc w:val="center"/>
+        <w:tblLayout w:type="fixed"/>
+        <w:tblLook w:firstColumn="1" w:firstRow="1" w:lastColumn="0" w:lastRow="0" w:noHBand="0" w:noVBand="1" w:val="04A0"/>
+      </w:tblPr>
+      <w:tblGrid>
+        <w:gridCol w:w="3120"/>
+        <w:gridCol w:w="3120"/>
+        <w:gridCol w:w="3120"/>
+      </w:tblGrid>
+      <w:tr>
+        <w:tc>
+          <w:tcPr>
+            <w:tcW w:type="dxa" w:w="2880"/>
+            <w:shd w:fill="F2F4F7"/>
+            <w:vAlign w:val="center"/>
+          </w:tcPr>
+          <w:p>
+            <w:pPr>
+              <w:spacing w:after="0"/>
+            </w:pPr>
+            <w:r/>
+            <w:r>
+              <w:rPr>
+                <w:b/>
+                <w:color w:val="1F4D78"/>
+              </w:rPr>
+              <w:t>Evidence item</w:t>
+            </w:r>
+          </w:p>
+        </w:tc>
+        <w:tc>
+          <w:tcPr>
+            <w:tcW w:type="dxa" w:w="2016"/>
+            <w:shd w:fill="F2F4F7"/>
+            <w:vAlign w:val="center"/>
+          </w:tcPr>
+          <w:p>
+            <w:pPr>
+              <w:spacing w:after="0"/>
+            </w:pPr>
+            <w:r/>
+            <w:r>
+              <w:rPr>
+                <w:b/>
+                <w:color w:val="1F4D78"/>
+              </w:rPr>
+              <w:t>Result</w:t>
+            </w:r>
+          </w:p>
+        </w:tc>
+        <w:tc>
+          <w:tcPr>
+            <w:tcW w:type="dxa" w:w="4032"/>
+            <w:shd w:fill="F2F4F7"/>
+            <w:vAlign w:val="center"/>
+          </w:tcPr>
+          <w:p>
+            <w:pPr>
+              <w:spacing w:after="0"/>
+            </w:pPr>
+            <w:r/>
+            <w:r>
+              <w:rPr>
+                <w:b/>
+                <w:color w:val="1F4D78"/>
+              </w:rPr>
+              <w:t>Interpretation</w:t>
+            </w:r>
+          </w:p>
+        </w:tc>
+      </w:tr>
+      <w:tr>
+        <w:tc>
+          <w:tcPr>
+            <w:tcW w:type="dxa" w:w="2880"/>
+            <w:vAlign w:val="center"/>
+          </w:tcPr>
+          <w:p>
+            <w:pPr>
+              <w:spacing w:after="0"/>
+            </w:pPr>
+            <w:r/>
+            <w:r>
+              <w:rPr>
+                <w:b w:val="0"/>
+              </w:rPr>
+              <w:t>Brier score</w:t>
+            </w:r>
+          </w:p>
+        </w:tc>
+        <w:tc>
+          <w:tcPr>
+            <w:tcW w:type="dxa" w:w="2016"/>
+            <w:vAlign w:val="center"/>
+          </w:tcPr>
+          <w:p>
+            <w:pPr>
+              <w:spacing w:after="0"/>
+            </w:pPr>
+            <w:r/>
+            <w:r>
+              <w:rPr>
+                <w:b w:val="0"/>
+              </w:rPr>
+              <w:t>0.2192</w:t>
+            </w:r>
+          </w:p>
+        </w:tc>
+        <w:tc>
+          <w:tcPr>
+            <w:tcW w:type="dxa" w:w="4032"/>
+            <w:vAlign w:val="center"/>
+          </w:tcPr>
+          <w:p>
+            <w:pPr>
+              <w:spacing w:after="0"/>
+            </w:pPr>
+            <w:r/>
+            <w:r>
+              <w:rPr>
+                <w:b w:val="0"/>
+              </w:rPr>
+              <w:t>Score is useful for ranking, but not production odds.</w:t>
+            </w:r>
+          </w:p>
+        </w:tc>
+      </w:tr>
+      <w:tr>
+        <w:tc>
+          <w:tcPr>
+            <w:tcW w:type="dxa" w:w="2880"/>
+            <w:vAlign w:val="center"/>
+          </w:tcPr>
+          <w:p>
+            <w:pPr>
+              <w:spacing w:after="0"/>
+            </w:pPr>
+            <w:r/>
+            <w:r>
+              <w:rPr>
+                <w:b w:val="0"/>
+              </w:rPr>
+              <w:t>Expected calibration error</w:t>
+            </w:r>
+          </w:p>
+        </w:tc>
+        <w:tc>
+          <w:tcPr>
+            <w:tcW w:type="dxa" w:w="2016"/>
+            <w:vAlign w:val="center"/>
+          </w:tcPr>
+          <w:p>
+            <w:pPr>
+              <w:spacing w:after="0"/>
+            </w:pPr>
+            <w:r/>
+            <w:r>
+              <w:rPr>
+                <w:b w:val="0"/>
+              </w:rPr>
+              <w:t>0.4132</w:t>
+            </w:r>
+          </w:p>
+        </w:tc>
+        <w:tc>
+          <w:tcPr>
+            <w:tcW w:type="dxa" w:w="4032"/>
+            <w:vAlign w:val="center"/>
+          </w:tcPr>
+          <w:p>
+            <w:pPr>
+              <w:spacing w:after="0"/>
+            </w:pPr>
+            <w:r/>
+            <w:r>
+              <w:rPr>
+                <w:b w:val="0"/>
+              </w:rPr>
+              <w:t>Real-data calibration remains an approval gate.</w:t>
+            </w:r>
+          </w:p>
+        </w:tc>
+      </w:tr>
+      <w:tr>
+        <w:tc>
+          <w:tcPr>
+            <w:tcW w:type="dxa" w:w="2880"/>
+            <w:vAlign w:val="center"/>
+          </w:tcPr>
+          <w:p>
+            <w:pPr>
+              <w:spacing w:after="0"/>
+            </w:pPr>
+            <w:r/>
+            <w:r>
+              <w:rPr>
+                <w:b w:val="0"/>
+              </w:rPr>
+              <w:t>Highest country FPR</w:t>
+            </w:r>
+          </w:p>
+        </w:tc>
+        <w:tc>
+          <w:tcPr>
+            <w:tcW w:type="dxa" w:w="2016"/>
+            <w:vAlign w:val="center"/>
+          </w:tcPr>
+          <w:p>
+            <w:pPr>
+              <w:spacing w:after="0"/>
+            </w:pPr>
+            <w:r/>
+            <w:r>
+              <w:rPr>
+                <w:b w:val="0"/>
+              </w:rPr>
+              <w:t>BR 60.3%</w:t>
+            </w:r>
+          </w:p>
+        </w:tc>
+        <w:tc>
+          <w:tcPr>
+            <w:tcW w:type="dxa" w:w="4032"/>
+            <w:vAlign w:val="center"/>
+          </w:tcPr>
+          <w:p>
+            <w:pPr>
+              <w:spacing w:after="0"/>
+            </w:pPr>
+            <w:r/>
+            <w:r>
+              <w:rPr>
+                <w:b w:val="0"/>
+              </w:rPr>
+              <w:t>Segment needs pilot monitoring for customer friction.</w:t>
+            </w:r>
+          </w:p>
+        </w:tc>
+      </w:tr>
+      <w:tr>
+        <w:tc>
+          <w:tcPr>
+            <w:tcW w:type="dxa" w:w="2880"/>
+            <w:vAlign w:val="center"/>
+          </w:tcPr>
+          <w:p>
+            <w:pPr>
+              <w:spacing w:after="0"/>
+            </w:pPr>
+            <w:r/>
+            <w:r>
+              <w:rPr>
+                <w:b w:val="0"/>
+              </w:rPr>
+              <w:t>Highest channel FPR</w:t>
+            </w:r>
+          </w:p>
+        </w:tc>
+        <w:tc>
+          <w:tcPr>
+            <w:tcW w:type="dxa" w:w="2016"/>
+            <w:vAlign w:val="center"/>
+          </w:tcPr>
+          <w:p>
+            <w:pPr>
+              <w:spacing w:after="0"/>
+            </w:pPr>
+            <w:r/>
+            <w:r>
+              <w:rPr>
+                <w:b w:val="0"/>
+              </w:rPr>
+              <w:t>P2P 7.5%</w:t>
+            </w:r>
+          </w:p>
+        </w:tc>
+        <w:tc>
+          <w:tcPr>
+            <w:tcW w:type="dxa" w:w="4032"/>
+            <w:vAlign w:val="center"/>
+          </w:tcPr>
+          <w:p>
+            <w:pPr>
+              <w:spacing w:after="0"/>
+            </w:pPr>
+            <w:r/>
+            <w:r>
+              <w:rPr>
+                <w:b w:val="0"/>
+              </w:rPr>
+              <w:t>Channel-level friction should be tracked weekly.</w:t>
+            </w:r>
+          </w:p>
+        </w:tc>
+      </w:tr>
+      <w:tr>
+        <w:tc>
+          <w:tcPr>
+            <w:tcW w:type="dxa" w:w="2880"/>
+            <w:vAlign w:val="center"/>
+          </w:tcPr>
+          <w:p>
+            <w:pPr>
+              <w:spacing w:after="0"/>
+            </w:pPr>
+            <w:r/>
+            <w:r>
+              <w:rPr>
+                <w:b w:val="0"/>
+              </w:rPr>
+              <w:t>SLA policy coverage</w:t>
+            </w:r>
+          </w:p>
+        </w:tc>
+        <w:tc>
+          <w:tcPr>
+            <w:tcW w:type="dxa" w:w="2016"/>
+            <w:vAlign w:val="center"/>
+          </w:tcPr>
+          <w:p>
+            <w:pPr>
+              <w:spacing w:after="0"/>
+            </w:pPr>
+            <w:r/>
+            <w:r>
+              <w:rPr>
+                <w:b w:val="0"/>
+              </w:rPr>
+              <w:t>100.0%</w:t>
+            </w:r>
+          </w:p>
+        </w:tc>
+        <w:tc>
+          <w:tcPr>
+            <w:tcW w:type="dxa" w:w="4032"/>
+            <w:vAlign w:val="center"/>
+          </w:tcPr>
+          <w:p>
+            <w:pPr>
+              <w:spacing w:after="0"/>
+            </w:pPr>
+            <w:r/>
+            <w:r>
+              <w:rPr>
+                <w:b w:val="0"/>
+              </w:rPr>
+              <w:t>Every routed case receives an urgency policy.</w:t>
+            </w:r>
+          </w:p>
+        </w:tc>
+      </w:tr>
+    </w:tbl>
+    <w:p/>
+    <w:p>
+      <w:r>
+        <w:t>True SLA breach rate cannot be measured from the current synthetic dataset because it does not contain investigation created, assigned, and closed timestamps. That timestamp capture is listed as a production instrumentation requirement.</w:t>
+      </w:r>
+    </w:p>
+    <w:p>
+      <w:pPr>
+        <w:pStyle w:val="Heading1"/>
+        <w:spacing w:before="320" w:after="160"/>
+      </w:pPr>
+      <w:r>
+        <w:rPr>
+          <w:b/>
+          <w:color w:val="2E74B5"/>
+          <w:sz w:val="32"/>
+        </w:rPr>
+        <w:t>7. Recommendation</w:t>
       </w:r>
     </w:p>
     <w:p>
@@ -925,7 +1310,7 @@
           <w:color w:val="2E74B5"/>
           <w:sz w:val="32"/>
         </w:rPr>
-        <w:t>7. Risks And Controls</w:t>
+        <w:t>8. Risks And Controls</w:t>
       </w:r>
     </w:p>
     <w:tbl>
@@ -1185,7 +1570,7 @@
           <w:color w:val="2E74B5"/>
           <w:sz w:val="32"/>
         </w:rPr>
-        <w:t>8. Conclusion</w:t>
+        <w:t>9. Conclusion</w:t>
       </w:r>
     </w:p>
     <w:p>

</xml_diff>